<commit_message>
refactor: prune develop.md bloat and add CI quality gate workflow
</commit_message>
<xml_diff>
--- a/docs/BM01b_So_nhat_ky_thuc_tap.docx
+++ b/docs/BM01b_So_nhat_ky_thuc_tap.docx
@@ -13205,7 +13205,7 @@
           <w:sz w:val="24"/>
           <w:rFonts w:ascii="Times New Roman" w:hAnsi="Times New Roman" w:cs="Times New Roman"/>
         </w:rPr>
-        <w:t>TUẦN 5: CONTEXTUAL APPLICATION PITCH, APPLICATION HUB &amp; INTERVIEW WORKSPACE (20/10/2026 – 23/10/2026)</w:t>
+        <w:t>TUẦN 5: CONTEXTUAL APPLICATION PITCH &amp; PROJECT DEFENSE BRIEFING (20/10/2026)</w:t>
       </w:r>
     </w:p>
     <w:tbl>
@@ -13628,1296 +13628,6 @@
                 <w:rFonts w:ascii="Times New Roman" w:hAnsi="Times New Roman" w:cs="Times New Roman"/>
               </w:rPr>
               <w:t>Trang bị bản lĩnh phòng thủ đồ án trước Tech Lead giúp ứng viên tự tin vượt qua cả vòng lọc CV lẫn vòng phỏng vấn kỹ thuật chuyên sâu.</w:t>
-            </w:r>
-          </w:p>
-        </w:tc>
-      </w:tr>
-    </w:tbl>
-    <w:p>
-      <w:pPr>
-        <w:spacing w:before="0" w:after="120"/>
-      </w:pPr>
-    </w:p>
-    <w:tbl>
-      <w:tblPr>
-        <w:tblW w:type="auto" w:w="0"/>
-        <w:jc w:val="center"/>
-        <w:tblLook w:firstColumn="1" w:firstRow="1" w:lastColumn="0" w:lastRow="0" w:noHBand="0" w:noVBand="1" w:val="04A0"/>
-        <w:tblBorders>
-          <w:top w:val="single" w:sz="4" w:space="0" w:color="A0AEC0"/>
-          <w:bottom w:val="single" w:sz="4" w:space="0" w:color="A0AEC0"/>
-          <w:left w:val="single" w:sz="4" w:space="0" w:color="A0AEC0"/>
-          <w:right w:val="single" w:sz="4" w:space="0" w:color="A0AEC0"/>
-          <w:insideH w:val="single" w:sz="4" w:space="0" w:color="A0AEC0"/>
-          <w:insideV w:val="single" w:sz="4" w:space="0" w:color="A0AEC0"/>
-        </w:tblBorders>
-      </w:tblPr>
-      <w:tblGrid>
-        <w:gridCol w:w="2339"/>
-        <w:gridCol w:w="2339"/>
-        <w:gridCol w:w="2339"/>
-        <w:gridCol w:w="2339"/>
-      </w:tblGrid>
-      <w:tr>
-        <w:tc>
-          <w:tcPr>
-            <w:tcW w:type="dxa" w:w="9354"/>
-            <w:gridSpan w:val="4"/>
-            <w:shd w:fill="EDF2F7"/>
-            <w:tcMar>
-              <w:top w:w="90" w:type="dxa"/>
-              <w:bottom w:w="90" w:type="dxa"/>
-              <w:left w:w="100" w:type="dxa"/>
-              <w:right w:w="100" w:type="dxa"/>
-            </w:tcMar>
-            <w:vAlign w:val="center"/>
-          </w:tcPr>
-          <w:p>
-            <w:pPr>
-              <w:spacing w:before="40" w:after="40" w:line="276" w:lineRule="auto"/>
-              <w:jc w:val="left"/>
-            </w:pPr>
-            <w:r/>
-            <w:r>
-              <w:rPr>
-                <w:rFonts w:ascii="Times New Roman" w:hAnsi="Times New Roman"/>
-                <w:b/>
-                <w:i w:val="0"/>
-                <w:color w:val="1A202C"/>
-                <w:sz w:val="22"/>
-                <w:rFonts w:ascii="Times New Roman" w:hAnsi="Times New Roman" w:cs="Times New Roman"/>
-              </w:rPr>
-              <w:t>Tuần: 5   Thứ: 4   Ngày: 21/10/2026</w:t>
-            </w:r>
-          </w:p>
-        </w:tc>
-      </w:tr>
-      <w:tr>
-        <w:tc>
-          <w:tcPr>
-            <w:tcW w:type="dxa" w:w="1474"/>
-            <w:shd w:fill="F7FAFC"/>
-            <w:tcMar>
-              <w:top w:w="70" w:type="dxa"/>
-              <w:bottom w:w="70" w:type="dxa"/>
-              <w:left w:w="70" w:type="dxa"/>
-              <w:right w:w="70" w:type="dxa"/>
-            </w:tcMar>
-            <w:vAlign w:val="center"/>
-          </w:tcPr>
-          <w:p>
-            <w:pPr>
-              <w:spacing w:before="40" w:after="40" w:line="276" w:lineRule="auto"/>
-              <w:jc w:val="center"/>
-            </w:pPr>
-            <w:r/>
-            <w:r>
-              <w:rPr>
-                <w:rFonts w:ascii="Times New Roman" w:hAnsi="Times New Roman"/>
-                <w:b/>
-                <w:i w:val="0"/>
-                <w:color w:val="000000"/>
-                <w:sz w:val="21"/>
-                <w:rFonts w:ascii="Times New Roman" w:hAnsi="Times New Roman" w:cs="Times New Roman"/>
-              </w:rPr>
-              <w:t>Thời gian</w:t>
-            </w:r>
-          </w:p>
-        </w:tc>
-        <w:tc>
-          <w:tcPr>
-            <w:tcW w:type="dxa" w:w="2551"/>
-            <w:shd w:fill="F7FAFC"/>
-            <w:tcMar>
-              <w:top w:w="70" w:type="dxa"/>
-              <w:bottom w:w="70" w:type="dxa"/>
-              <w:left w:w="70" w:type="dxa"/>
-              <w:right w:w="70" w:type="dxa"/>
-            </w:tcMar>
-            <w:vAlign w:val="center"/>
-          </w:tcPr>
-          <w:p>
-            <w:pPr>
-              <w:spacing w:before="40" w:after="40" w:line="276" w:lineRule="auto"/>
-              <w:jc w:val="center"/>
-            </w:pPr>
-            <w:r/>
-            <w:r>
-              <w:rPr>
-                <w:rFonts w:ascii="Times New Roman" w:hAnsi="Times New Roman"/>
-                <w:b/>
-                <w:i w:val="0"/>
-                <w:color w:val="000000"/>
-                <w:sz w:val="21"/>
-                <w:rFonts w:ascii="Times New Roman" w:hAnsi="Times New Roman" w:cs="Times New Roman"/>
-              </w:rPr>
-              <w:t>Công việc được giao</w:t>
-            </w:r>
-          </w:p>
-        </w:tc>
-        <w:tc>
-          <w:tcPr>
-            <w:tcW w:type="dxa" w:w="3061"/>
-            <w:shd w:fill="F7FAFC"/>
-            <w:tcMar>
-              <w:top w:w="70" w:type="dxa"/>
-              <w:bottom w:w="70" w:type="dxa"/>
-              <w:left w:w="70" w:type="dxa"/>
-              <w:right w:w="70" w:type="dxa"/>
-            </w:tcMar>
-            <w:vAlign w:val="center"/>
-          </w:tcPr>
-          <w:p>
-            <w:pPr>
-              <w:spacing w:before="40" w:after="40" w:line="276" w:lineRule="auto"/>
-              <w:jc w:val="center"/>
-            </w:pPr>
-            <w:r/>
-            <w:r>
-              <w:rPr>
-                <w:rFonts w:ascii="Times New Roman" w:hAnsi="Times New Roman"/>
-                <w:b/>
-                <w:i w:val="0"/>
-                <w:color w:val="000000"/>
-                <w:sz w:val="21"/>
-                <w:rFonts w:ascii="Times New Roman" w:hAnsi="Times New Roman" w:cs="Times New Roman"/>
-              </w:rPr>
-              <w:t>Kết quả thực hiện</w:t>
-            </w:r>
-          </w:p>
-        </w:tc>
-        <w:tc>
-          <w:tcPr>
-            <w:tcW w:type="dxa" w:w="2268"/>
-            <w:shd w:fill="F7FAFC"/>
-            <w:tcMar>
-              <w:top w:w="70" w:type="dxa"/>
-              <w:bottom w:w="70" w:type="dxa"/>
-              <w:left w:w="70" w:type="dxa"/>
-              <w:right w:w="70" w:type="dxa"/>
-            </w:tcMar>
-            <w:vAlign w:val="center"/>
-          </w:tcPr>
-          <w:p>
-            <w:pPr>
-              <w:spacing w:before="40" w:after="40" w:line="276" w:lineRule="auto"/>
-              <w:jc w:val="center"/>
-            </w:pPr>
-            <w:r/>
-            <w:r>
-              <w:rPr>
-                <w:rFonts w:ascii="Times New Roman" w:hAnsi="Times New Roman"/>
-                <w:b/>
-                <w:i w:val="0"/>
-                <w:color w:val="000000"/>
-                <w:sz w:val="21"/>
-                <w:rFonts w:ascii="Times New Roman" w:hAnsi="Times New Roman" w:cs="Times New Roman"/>
-              </w:rPr>
-              <w:t>Kinh nghiệm</w:t>
-            </w:r>
-          </w:p>
-        </w:tc>
-      </w:tr>
-      <w:tr>
-        <w:tc>
-          <w:tcPr>
-            <w:tcW w:type="dxa" w:w="1474"/>
-            <w:vAlign w:val="center"/>
-            <w:tcMar>
-              <w:top w:w="70" w:type="dxa"/>
-              <w:bottom w:w="70" w:type="dxa"/>
-              <w:left w:w="70" w:type="dxa"/>
-              <w:right w:w="70" w:type="dxa"/>
-            </w:tcMar>
-          </w:tcPr>
-          <w:p>
-            <w:pPr>
-              <w:spacing w:before="40" w:after="40" w:line="276" w:lineRule="auto"/>
-              <w:jc w:val="center"/>
-            </w:pPr>
-            <w:r/>
-            <w:r>
-              <w:rPr>
-                <w:rFonts w:ascii="Times New Roman" w:hAnsi="Times New Roman"/>
-                <w:b/>
-                <w:i w:val="0"/>
-                <w:color w:val="000000"/>
-                <w:sz w:val="20"/>
-                <w:rFonts w:ascii="Times New Roman" w:hAnsi="Times New Roman" w:cs="Times New Roman"/>
-              </w:rPr>
-              <w:t>08:30 - 12:00</w:t>
-            </w:r>
-          </w:p>
-        </w:tc>
-        <w:tc>
-          <w:tcPr>
-            <w:tcW w:type="dxa" w:w="2551"/>
-            <w:vAlign w:val="center"/>
-            <w:tcMar>
-              <w:top w:w="70" w:type="dxa"/>
-              <w:bottom w:w="70" w:type="dxa"/>
-              <w:left w:w="70" w:type="dxa"/>
-              <w:right w:w="70" w:type="dxa"/>
-            </w:tcMar>
-          </w:tcPr>
-          <w:p>
-            <w:pPr>
-              <w:spacing w:before="40" w:after="40" w:line="276" w:lineRule="auto"/>
-              <w:jc w:val="left"/>
-            </w:pPr>
-            <w:r/>
-            <w:r>
-              <w:rPr>
-                <w:rFonts w:ascii="Times New Roman" w:hAnsi="Times New Roman"/>
-                <w:b w:val="0"/>
-                <w:i w:val="0"/>
-                <w:color w:val="000000"/>
-                <w:sz w:val="20"/>
-                <w:rFonts w:ascii="Times New Roman" w:hAnsi="Times New Roman" w:cs="Times New Roman"/>
-              </w:rPr>
-              <w:t>Thiết kế CSDL &amp; Tầng dịch vụ Student Application Hub (applicationService.ts)</w:t>
-            </w:r>
-          </w:p>
-        </w:tc>
-        <w:tc>
-          <w:tcPr>
-            <w:tcW w:type="dxa" w:w="3061"/>
-            <w:vAlign w:val="center"/>
-            <w:tcMar>
-              <w:top w:w="70" w:type="dxa"/>
-              <w:bottom w:w="70" w:type="dxa"/>
-              <w:left w:w="70" w:type="dxa"/>
-              <w:right w:w="70" w:type="dxa"/>
-            </w:tcMar>
-          </w:tcPr>
-          <w:p>
-            <w:pPr>
-              <w:spacing w:before="40" w:after="40" w:line="276" w:lineRule="auto"/>
-              <w:jc w:val="left"/>
-            </w:pPr>
-            <w:r/>
-            <w:r>
-              <w:rPr>
-                <w:rFonts w:ascii="Times New Roman" w:hAnsi="Times New Roman"/>
-                <w:b w:val="0"/>
-                <w:i w:val="0"/>
-                <w:color w:val="000000"/>
-                <w:sz w:val="20"/>
-                <w:rFonts w:ascii="Times New Roman" w:hAnsi="Times New Roman" w:cs="Times New Roman"/>
-              </w:rPr>
-              <w:t>Thiết kế thực thể StudentApplication với 9 trạng thái tuyển dụng. Xây dựng applicationService.ts: Hiện thực hóa quy tắc Snapshot Pattern — Đóng băng bản CV và JD tại thời điểm ứng tuyển, bảo toàn dữ liệu độc lập với Master Profile.</w:t>
-            </w:r>
-          </w:p>
-        </w:tc>
-        <w:tc>
-          <w:tcPr>
-            <w:tcW w:type="dxa" w:w="2268"/>
-            <w:vAlign w:val="center"/>
-            <w:tcMar>
-              <w:top w:w="70" w:type="dxa"/>
-              <w:bottom w:w="70" w:type="dxa"/>
-              <w:left w:w="70" w:type="dxa"/>
-              <w:right w:w="70" w:type="dxa"/>
-            </w:tcMar>
-          </w:tcPr>
-          <w:p>
-            <w:pPr>
-              <w:spacing w:before="40" w:after="40" w:line="276" w:lineRule="auto"/>
-              <w:jc w:val="left"/>
-            </w:pPr>
-            <w:r/>
-            <w:r>
-              <w:rPr>
-                <w:rFonts w:ascii="Times New Roman" w:hAnsi="Times New Roman"/>
-                <w:b w:val="0"/>
-                <w:i w:val="0"/>
-                <w:color w:val="000000"/>
-                <w:sz w:val="20"/>
-                <w:rFonts w:ascii="Times New Roman" w:hAnsi="Times New Roman" w:cs="Times New Roman"/>
-              </w:rPr>
-              <w:t>Áp dụng Snapshot Pattern ở tầng ứng tuyển bảo vệ ứng viên khỏi rủi ro quên phiên bản CV đã nộp khi nhà tuyển dụng liên hệ phỏng vấn.</w:t>
-            </w:r>
-          </w:p>
-        </w:tc>
-      </w:tr>
-      <w:tr>
-        <w:tc>
-          <w:tcPr>
-            <w:tcW w:type="dxa" w:w="1474"/>
-            <w:vAlign w:val="center"/>
-            <w:tcMar>
-              <w:top w:w="70" w:type="dxa"/>
-              <w:bottom w:w="70" w:type="dxa"/>
-              <w:left w:w="70" w:type="dxa"/>
-              <w:right w:w="70" w:type="dxa"/>
-            </w:tcMar>
-          </w:tcPr>
-          <w:p>
-            <w:pPr>
-              <w:spacing w:before="40" w:after="40" w:line="276" w:lineRule="auto"/>
-              <w:jc w:val="center"/>
-            </w:pPr>
-            <w:r/>
-            <w:r>
-              <w:rPr>
-                <w:rFonts w:ascii="Times New Roman" w:hAnsi="Times New Roman"/>
-                <w:b/>
-                <w:i w:val="0"/>
-                <w:color w:val="000000"/>
-                <w:sz w:val="20"/>
-                <w:rFonts w:ascii="Times New Roman" w:hAnsi="Times New Roman" w:cs="Times New Roman"/>
-              </w:rPr>
-              <w:t>13:00 - 17:00</w:t>
-            </w:r>
-          </w:p>
-        </w:tc>
-        <w:tc>
-          <w:tcPr>
-            <w:tcW w:type="dxa" w:w="2551"/>
-            <w:vAlign w:val="center"/>
-            <w:tcMar>
-              <w:top w:w="70" w:type="dxa"/>
-              <w:bottom w:w="70" w:type="dxa"/>
-              <w:left w:w="70" w:type="dxa"/>
-              <w:right w:w="70" w:type="dxa"/>
-            </w:tcMar>
-          </w:tcPr>
-          <w:p>
-            <w:pPr>
-              <w:spacing w:before="40" w:after="40" w:line="276" w:lineRule="auto"/>
-              <w:jc w:val="left"/>
-            </w:pPr>
-            <w:r/>
-            <w:r>
-              <w:rPr>
-                <w:rFonts w:ascii="Times New Roman" w:hAnsi="Times New Roman"/>
-                <w:b w:val="0"/>
-                <w:i w:val="0"/>
-                <w:color w:val="000000"/>
-                <w:sz w:val="20"/>
-                <w:rFonts w:ascii="Times New Roman" w:hAnsi="Times New Roman" w:cs="Times New Roman"/>
-              </w:rPr>
-              <w:t>Tích hợp luồng ứng tuyển tự động từ StudentJobs.tsx &amp; Bộ kiểm thử TDD</w:t>
-            </w:r>
-          </w:p>
-        </w:tc>
-        <w:tc>
-          <w:tcPr>
-            <w:tcW w:type="dxa" w:w="3061"/>
-            <w:vAlign w:val="center"/>
-            <w:tcMar>
-              <w:top w:w="70" w:type="dxa"/>
-              <w:bottom w:w="70" w:type="dxa"/>
-              <w:left w:w="70" w:type="dxa"/>
-              <w:right w:w="70" w:type="dxa"/>
-            </w:tcMar>
-          </w:tcPr>
-          <w:p>
-            <w:pPr>
-              <w:spacing w:before="40" w:after="40" w:line="276" w:lineRule="auto"/>
-              <w:jc w:val="left"/>
-            </w:pPr>
-            <w:r/>
-            <w:r>
-              <w:rPr>
-                <w:rFonts w:ascii="Times New Roman" w:hAnsi="Times New Roman"/>
-                <w:b w:val="0"/>
-                <w:i w:val="0"/>
-                <w:color w:val="000000"/>
-                <w:sz w:val="20"/>
-                <w:rFonts w:ascii="Times New Roman" w:hAnsi="Times New Roman" w:cs="Times New Roman"/>
-              </w:rPr>
-              <w:t>Kết nối nút 'Nộp CV &amp; Ứng tuyển' trên StudentJobs.tsx tự động đẩy hồ sơ vào Application Hub cá nhân kèm snapshot CV đang active. Viết bộ kiểm thử TDD applicationService.test.ts (TC-APP-01, TC-APP-02) xác thực bất biến và lịch sử trạng thái.</w:t>
-            </w:r>
-          </w:p>
-        </w:tc>
-        <w:tc>
-          <w:tcPr>
-            <w:tcW w:type="dxa" w:w="2268"/>
-            <w:vAlign w:val="center"/>
-            <w:tcMar>
-              <w:top w:w="70" w:type="dxa"/>
-              <w:bottom w:w="70" w:type="dxa"/>
-              <w:left w:w="70" w:type="dxa"/>
-              <w:right w:w="70" w:type="dxa"/>
-            </w:tcMar>
-          </w:tcPr>
-          <w:p>
-            <w:pPr>
-              <w:spacing w:before="40" w:after="40" w:line="276" w:lineRule="auto"/>
-              <w:jc w:val="left"/>
-            </w:pPr>
-            <w:r/>
-            <w:r>
-              <w:rPr>
-                <w:rFonts w:ascii="Times New Roman" w:hAnsi="Times New Roman"/>
-                <w:b w:val="0"/>
-                <w:i w:val="0"/>
-                <w:color w:val="000000"/>
-                <w:sz w:val="20"/>
-                <w:rFonts w:ascii="Times New Roman" w:hAnsi="Times New Roman" w:cs="Times New Roman"/>
-              </w:rPr>
-              <w:t>Tự động hóa luồng lưu trữ đơn ứng tuyển từ cổng việc làm giúp giảm tối đa thao tác nhập liệu thủ công cho sinh viên.</w:t>
-            </w:r>
-          </w:p>
-        </w:tc>
-      </w:tr>
-    </w:tbl>
-    <w:p>
-      <w:pPr>
-        <w:spacing w:before="0" w:after="120"/>
-      </w:pPr>
-    </w:p>
-    <w:tbl>
-      <w:tblPr>
-        <w:tblW w:type="auto" w:w="0"/>
-        <w:jc w:val="center"/>
-        <w:tblLook w:firstColumn="1" w:firstRow="1" w:lastColumn="0" w:lastRow="0" w:noHBand="0" w:noVBand="1" w:val="04A0"/>
-        <w:tblBorders>
-          <w:top w:val="single" w:sz="4" w:space="0" w:color="A0AEC0"/>
-          <w:bottom w:val="single" w:sz="4" w:space="0" w:color="A0AEC0"/>
-          <w:left w:val="single" w:sz="4" w:space="0" w:color="A0AEC0"/>
-          <w:right w:val="single" w:sz="4" w:space="0" w:color="A0AEC0"/>
-          <w:insideH w:val="single" w:sz="4" w:space="0" w:color="A0AEC0"/>
-          <w:insideV w:val="single" w:sz="4" w:space="0" w:color="A0AEC0"/>
-        </w:tblBorders>
-      </w:tblPr>
-      <w:tblGrid>
-        <w:gridCol w:w="2339"/>
-        <w:gridCol w:w="2339"/>
-        <w:gridCol w:w="2339"/>
-        <w:gridCol w:w="2339"/>
-      </w:tblGrid>
-      <w:tr>
-        <w:tc>
-          <w:tcPr>
-            <w:tcW w:type="dxa" w:w="9354"/>
-            <w:gridSpan w:val="4"/>
-            <w:shd w:fill="EDF2F7"/>
-            <w:tcMar>
-              <w:top w:w="90" w:type="dxa"/>
-              <w:bottom w:w="90" w:type="dxa"/>
-              <w:left w:w="100" w:type="dxa"/>
-              <w:right w:w="100" w:type="dxa"/>
-            </w:tcMar>
-            <w:vAlign w:val="center"/>
-          </w:tcPr>
-          <w:p>
-            <w:pPr>
-              <w:spacing w:before="40" w:after="40" w:line="276" w:lineRule="auto"/>
-              <w:jc w:val="left"/>
-            </w:pPr>
-            <w:r/>
-            <w:r>
-              <w:rPr>
-                <w:rFonts w:ascii="Times New Roman" w:hAnsi="Times New Roman"/>
-                <w:b/>
-                <w:i w:val="0"/>
-                <w:color w:val="1A202C"/>
-                <w:sz w:val="22"/>
-                <w:rFonts w:ascii="Times New Roman" w:hAnsi="Times New Roman" w:cs="Times New Roman"/>
-              </w:rPr>
-              <w:t>Tuần: 5   Thứ: 5   Ngày: 22/10/2026</w:t>
-            </w:r>
-          </w:p>
-        </w:tc>
-      </w:tr>
-      <w:tr>
-        <w:tc>
-          <w:tcPr>
-            <w:tcW w:type="dxa" w:w="1474"/>
-            <w:shd w:fill="F7FAFC"/>
-            <w:tcMar>
-              <w:top w:w="70" w:type="dxa"/>
-              <w:bottom w:w="70" w:type="dxa"/>
-              <w:left w:w="70" w:type="dxa"/>
-              <w:right w:w="70" w:type="dxa"/>
-            </w:tcMar>
-            <w:vAlign w:val="center"/>
-          </w:tcPr>
-          <w:p>
-            <w:pPr>
-              <w:spacing w:before="40" w:after="40" w:line="276" w:lineRule="auto"/>
-              <w:jc w:val="center"/>
-            </w:pPr>
-            <w:r/>
-            <w:r>
-              <w:rPr>
-                <w:rFonts w:ascii="Times New Roman" w:hAnsi="Times New Roman"/>
-                <w:b/>
-                <w:i w:val="0"/>
-                <w:color w:val="000000"/>
-                <w:sz w:val="21"/>
-                <w:rFonts w:ascii="Times New Roman" w:hAnsi="Times New Roman" w:cs="Times New Roman"/>
-              </w:rPr>
-              <w:t>Thời gian</w:t>
-            </w:r>
-          </w:p>
-        </w:tc>
-        <w:tc>
-          <w:tcPr>
-            <w:tcW w:type="dxa" w:w="2551"/>
-            <w:shd w:fill="F7FAFC"/>
-            <w:tcMar>
-              <w:top w:w="70" w:type="dxa"/>
-              <w:bottom w:w="70" w:type="dxa"/>
-              <w:left w:w="70" w:type="dxa"/>
-              <w:right w:w="70" w:type="dxa"/>
-            </w:tcMar>
-            <w:vAlign w:val="center"/>
-          </w:tcPr>
-          <w:p>
-            <w:pPr>
-              <w:spacing w:before="40" w:after="40" w:line="276" w:lineRule="auto"/>
-              <w:jc w:val="center"/>
-            </w:pPr>
-            <w:r/>
-            <w:r>
-              <w:rPr>
-                <w:rFonts w:ascii="Times New Roman" w:hAnsi="Times New Roman"/>
-                <w:b/>
-                <w:i w:val="0"/>
-                <w:color w:val="000000"/>
-                <w:sz w:val="21"/>
-                <w:rFonts w:ascii="Times New Roman" w:hAnsi="Times New Roman" w:cs="Times New Roman"/>
-              </w:rPr>
-              <w:t>Công việc được giao</w:t>
-            </w:r>
-          </w:p>
-        </w:tc>
-        <w:tc>
-          <w:tcPr>
-            <w:tcW w:type="dxa" w:w="3061"/>
-            <w:shd w:fill="F7FAFC"/>
-            <w:tcMar>
-              <w:top w:w="70" w:type="dxa"/>
-              <w:bottom w:w="70" w:type="dxa"/>
-              <w:left w:w="70" w:type="dxa"/>
-              <w:right w:w="70" w:type="dxa"/>
-            </w:tcMar>
-            <w:vAlign w:val="center"/>
-          </w:tcPr>
-          <w:p>
-            <w:pPr>
-              <w:spacing w:before="40" w:after="40" w:line="276" w:lineRule="auto"/>
-              <w:jc w:val="center"/>
-            </w:pPr>
-            <w:r/>
-            <w:r>
-              <w:rPr>
-                <w:rFonts w:ascii="Times New Roman" w:hAnsi="Times New Roman"/>
-                <w:b/>
-                <w:i w:val="0"/>
-                <w:color w:val="000000"/>
-                <w:sz w:val="21"/>
-                <w:rFonts w:ascii="Times New Roman" w:hAnsi="Times New Roman" w:cs="Times New Roman"/>
-              </w:rPr>
-              <w:t>Kết quả thực hiện</w:t>
-            </w:r>
-          </w:p>
-        </w:tc>
-        <w:tc>
-          <w:tcPr>
-            <w:tcW w:type="dxa" w:w="2268"/>
-            <w:shd w:fill="F7FAFC"/>
-            <w:tcMar>
-              <w:top w:w="70" w:type="dxa"/>
-              <w:bottom w:w="70" w:type="dxa"/>
-              <w:left w:w="70" w:type="dxa"/>
-              <w:right w:w="70" w:type="dxa"/>
-            </w:tcMar>
-            <w:vAlign w:val="center"/>
-          </w:tcPr>
-          <w:p>
-            <w:pPr>
-              <w:spacing w:before="40" w:after="40" w:line="276" w:lineRule="auto"/>
-              <w:jc w:val="center"/>
-            </w:pPr>
-            <w:r/>
-            <w:r>
-              <w:rPr>
-                <w:rFonts w:ascii="Times New Roman" w:hAnsi="Times New Roman"/>
-                <w:b/>
-                <w:i w:val="0"/>
-                <w:color w:val="000000"/>
-                <w:sz w:val="21"/>
-                <w:rFonts w:ascii="Times New Roman" w:hAnsi="Times New Roman" w:cs="Times New Roman"/>
-              </w:rPr>
-              <w:t>Kinh nghiệm</w:t>
-            </w:r>
-          </w:p>
-        </w:tc>
-      </w:tr>
-      <w:tr>
-        <w:tc>
-          <w:tcPr>
-            <w:tcW w:type="dxa" w:w="1474"/>
-            <w:vAlign w:val="center"/>
-            <w:tcMar>
-              <w:top w:w="70" w:type="dxa"/>
-              <w:bottom w:w="70" w:type="dxa"/>
-              <w:left w:w="70" w:type="dxa"/>
-              <w:right w:w="70" w:type="dxa"/>
-            </w:tcMar>
-          </w:tcPr>
-          <w:p>
-            <w:pPr>
-              <w:spacing w:before="40" w:after="40" w:line="276" w:lineRule="auto"/>
-              <w:jc w:val="center"/>
-            </w:pPr>
-            <w:r/>
-            <w:r>
-              <w:rPr>
-                <w:rFonts w:ascii="Times New Roman" w:hAnsi="Times New Roman"/>
-                <w:b/>
-                <w:i w:val="0"/>
-                <w:color w:val="000000"/>
-                <w:sz w:val="20"/>
-                <w:rFonts w:ascii="Times New Roman" w:hAnsi="Times New Roman" w:cs="Times New Roman"/>
-              </w:rPr>
-              <w:t>08:30 - 12:00</w:t>
-            </w:r>
-          </w:p>
-        </w:tc>
-        <w:tc>
-          <w:tcPr>
-            <w:tcW w:type="dxa" w:w="2551"/>
-            <w:vAlign w:val="center"/>
-            <w:tcMar>
-              <w:top w:w="70" w:type="dxa"/>
-              <w:bottom w:w="70" w:type="dxa"/>
-              <w:left w:w="70" w:type="dxa"/>
-              <w:right w:w="70" w:type="dxa"/>
-            </w:tcMar>
-          </w:tcPr>
-          <w:p>
-            <w:pPr>
-              <w:spacing w:before="40" w:after="40" w:line="276" w:lineRule="auto"/>
-              <w:jc w:val="left"/>
-            </w:pPr>
-            <w:r/>
-            <w:r>
-              <w:rPr>
-                <w:rFonts w:ascii="Times New Roman" w:hAnsi="Times New Roman"/>
-                <w:b w:val="0"/>
-                <w:i w:val="0"/>
-                <w:color w:val="000000"/>
-                <w:sz w:val="20"/>
-                <w:rFonts w:ascii="Times New Roman" w:hAnsi="Times New Roman" w:cs="Times New Roman"/>
-              </w:rPr>
-              <w:t>Phát triển giao diện Bảng Kanban Tiến trình Ứng tuyển 6 Cột (StudentApplicationsPage)</w:t>
-            </w:r>
-          </w:p>
-        </w:tc>
-        <w:tc>
-          <w:tcPr>
-            <w:tcW w:type="dxa" w:w="3061"/>
-            <w:vAlign w:val="center"/>
-            <w:tcMar>
-              <w:top w:w="70" w:type="dxa"/>
-              <w:bottom w:w="70" w:type="dxa"/>
-              <w:left w:w="70" w:type="dxa"/>
-              <w:right w:w="70" w:type="dxa"/>
-            </w:tcMar>
-          </w:tcPr>
-          <w:p>
-            <w:pPr>
-              <w:spacing w:before="40" w:after="40" w:line="276" w:lineRule="auto"/>
-              <w:jc w:val="left"/>
-            </w:pPr>
-            <w:r/>
-            <w:r>
-              <w:rPr>
-                <w:rFonts w:ascii="Times New Roman" w:hAnsi="Times New Roman"/>
-                <w:b w:val="0"/>
-                <w:i w:val="0"/>
-                <w:color w:val="000000"/>
-                <w:sz w:val="20"/>
-                <w:rFonts w:ascii="Times New Roman" w:hAnsi="Times New Roman" w:cs="Times New Roman"/>
-              </w:rPr>
-              <w:t>Xây dựng giao diện Kanban 6 cột trực quan: Chuẩn bị/Lưu -&gt; Đã nộp -&gt; Phỏng vấn HR -&gt; Phỏng vấn Kỹ thuật -&gt; Nhận Offer -&gt; Dừng tuyển. Hiển thị thẻ Application Card kèm chip ưu tiên HOT, tên bản CV snapshot và thời gian nộp.</w:t>
-            </w:r>
-          </w:p>
-        </w:tc>
-        <w:tc>
-          <w:tcPr>
-            <w:tcW w:type="dxa" w:w="2268"/>
-            <w:vAlign w:val="center"/>
-            <w:tcMar>
-              <w:top w:w="70" w:type="dxa"/>
-              <w:bottom w:w="70" w:type="dxa"/>
-              <w:left w:w="70" w:type="dxa"/>
-              <w:right w:w="70" w:type="dxa"/>
-            </w:tcMar>
-          </w:tcPr>
-          <w:p>
-            <w:pPr>
-              <w:spacing w:before="40" w:after="40" w:line="276" w:lineRule="auto"/>
-              <w:jc w:val="left"/>
-            </w:pPr>
-            <w:r/>
-            <w:r>
-              <w:rPr>
-                <w:rFonts w:ascii="Times New Roman" w:hAnsi="Times New Roman"/>
-                <w:b w:val="0"/>
-                <w:i w:val="0"/>
-                <w:color w:val="000000"/>
-                <w:sz w:val="20"/>
-                <w:rFonts w:ascii="Times New Roman" w:hAnsi="Times New Roman" w:cs="Times New Roman"/>
-              </w:rPr>
-              <w:t>Trực quan hóa tiến trình hồ sơ bằng Kanban board giúp sinh viên nắm bắt bức tranh toàn cảnh phễu ứng tuyển cá nhân.</w:t>
-            </w:r>
-          </w:p>
-        </w:tc>
-      </w:tr>
-      <w:tr>
-        <w:tc>
-          <w:tcPr>
-            <w:tcW w:type="dxa" w:w="1474"/>
-            <w:vAlign w:val="center"/>
-            <w:tcMar>
-              <w:top w:w="70" w:type="dxa"/>
-              <w:bottom w:w="70" w:type="dxa"/>
-              <w:left w:w="70" w:type="dxa"/>
-              <w:right w:w="70" w:type="dxa"/>
-            </w:tcMar>
-          </w:tcPr>
-          <w:p>
-            <w:pPr>
-              <w:spacing w:before="40" w:after="40" w:line="276" w:lineRule="auto"/>
-              <w:jc w:val="center"/>
-            </w:pPr>
-            <w:r/>
-            <w:r>
-              <w:rPr>
-                <w:rFonts w:ascii="Times New Roman" w:hAnsi="Times New Roman"/>
-                <w:b/>
-                <w:i w:val="0"/>
-                <w:color w:val="000000"/>
-                <w:sz w:val="20"/>
-                <w:rFonts w:ascii="Times New Roman" w:hAnsi="Times New Roman" w:cs="Times New Roman"/>
-              </w:rPr>
-              <w:t>13:00 - 17:00</w:t>
-            </w:r>
-          </w:p>
-        </w:tc>
-        <w:tc>
-          <w:tcPr>
-            <w:tcW w:type="dxa" w:w="2551"/>
-            <w:vAlign w:val="center"/>
-            <w:tcMar>
-              <w:top w:w="70" w:type="dxa"/>
-              <w:bottom w:w="70" w:type="dxa"/>
-              <w:left w:w="70" w:type="dxa"/>
-              <w:right w:w="70" w:type="dxa"/>
-            </w:tcMar>
-          </w:tcPr>
-          <w:p>
-            <w:pPr>
-              <w:spacing w:before="40" w:after="40" w:line="276" w:lineRule="auto"/>
-              <w:jc w:val="left"/>
-            </w:pPr>
-            <w:r/>
-            <w:r>
-              <w:rPr>
-                <w:rFonts w:ascii="Times New Roman" w:hAnsi="Times New Roman"/>
-                <w:b w:val="0"/>
-                <w:i w:val="0"/>
-                <w:color w:val="000000"/>
-                <w:sz w:val="20"/>
-                <w:rFonts w:ascii="Times New Roman" w:hAnsi="Times New Roman" w:cs="Times New Roman"/>
-              </w:rPr>
-              <w:t>Xây dựng cơ chế Status History an toàn &amp; Modal xem chi tiết hồ sơ snapshot</w:t>
-            </w:r>
-          </w:p>
-        </w:tc>
-        <w:tc>
-          <w:tcPr>
-            <w:tcW w:type="dxa" w:w="3061"/>
-            <w:vAlign w:val="center"/>
-            <w:tcMar>
-              <w:top w:w="70" w:type="dxa"/>
-              <w:bottom w:w="70" w:type="dxa"/>
-              <w:left w:w="70" w:type="dxa"/>
-              <w:right w:w="70" w:type="dxa"/>
-            </w:tcMar>
-          </w:tcPr>
-          <w:p>
-            <w:pPr>
-              <w:spacing w:before="40" w:after="40" w:line="276" w:lineRule="auto"/>
-              <w:jc w:val="left"/>
-            </w:pPr>
-            <w:r/>
-            <w:r>
-              <w:rPr>
-                <w:rFonts w:ascii="Times New Roman" w:hAnsi="Times New Roman"/>
-                <w:b w:val="0"/>
-                <w:i w:val="0"/>
-                <w:color w:val="000000"/>
-                <w:sz w:val="20"/>
-                <w:rFonts w:ascii="Times New Roman" w:hAnsi="Times New Roman" w:cs="Times New Roman"/>
-              </w:rPr>
-              <w:t>Hiện thực hóa StatusHistoryEntry ghi nhận vết chuyển trạng thái (trạng thái cũ/mới, thời gian, lý do). Xây dựng Modal chi tiết hiển thị toàn văn JD gốc và thông tin bản CV đóng băng. Bổ sung test TC-APP-03, TC-APP-04 (thăng cấp trạng thái, Archive).</w:t>
-            </w:r>
-          </w:p>
-        </w:tc>
-        <w:tc>
-          <w:tcPr>
-            <w:tcW w:type="dxa" w:w="2268"/>
-            <w:vAlign w:val="center"/>
-            <w:tcMar>
-              <w:top w:w="70" w:type="dxa"/>
-              <w:bottom w:w="70" w:type="dxa"/>
-              <w:left w:w="70" w:type="dxa"/>
-              <w:right w:w="70" w:type="dxa"/>
-            </w:tcMar>
-          </w:tcPr>
-          <w:p>
-            <w:pPr>
-              <w:spacing w:before="40" w:after="40" w:line="276" w:lineRule="auto"/>
-              <w:jc w:val="left"/>
-            </w:pPr>
-            <w:r/>
-            <w:r>
-              <w:rPr>
-                <w:rFonts w:ascii="Times New Roman" w:hAnsi="Times New Roman"/>
-                <w:b w:val="0"/>
-                <w:i w:val="0"/>
-                <w:color w:val="000000"/>
-                <w:sz w:val="20"/>
-                <w:rFonts w:ascii="Times New Roman" w:hAnsi="Times New Roman" w:cs="Times New Roman"/>
-              </w:rPr>
-              <w:t>Lưu vết lịch sử chuyển đổi trạng thái đảm bảo tính minh bạch và cung cấp dữ liệu chính xác cho các phân tích chuyển đổi sau này.</w:t>
-            </w:r>
-          </w:p>
-        </w:tc>
-      </w:tr>
-    </w:tbl>
-    <w:p>
-      <w:pPr>
-        <w:spacing w:before="0" w:after="120"/>
-      </w:pPr>
-    </w:p>
-    <w:tbl>
-      <w:tblPr>
-        <w:tblW w:type="auto" w:w="0"/>
-        <w:jc w:val="center"/>
-        <w:tblLook w:firstColumn="1" w:firstRow="1" w:lastColumn="0" w:lastRow="0" w:noHBand="0" w:noVBand="1" w:val="04A0"/>
-        <w:tblBorders>
-          <w:top w:val="single" w:sz="4" w:space="0" w:color="A0AEC0"/>
-          <w:bottom w:val="single" w:sz="4" w:space="0" w:color="A0AEC0"/>
-          <w:left w:val="single" w:sz="4" w:space="0" w:color="A0AEC0"/>
-          <w:right w:val="single" w:sz="4" w:space="0" w:color="A0AEC0"/>
-          <w:insideH w:val="single" w:sz="4" w:space="0" w:color="A0AEC0"/>
-          <w:insideV w:val="single" w:sz="4" w:space="0" w:color="A0AEC0"/>
-        </w:tblBorders>
-      </w:tblPr>
-      <w:tblGrid>
-        <w:gridCol w:w="2339"/>
-        <w:gridCol w:w="2339"/>
-        <w:gridCol w:w="2339"/>
-        <w:gridCol w:w="2339"/>
-      </w:tblGrid>
-      <w:tr>
-        <w:tc>
-          <w:tcPr>
-            <w:tcW w:type="dxa" w:w="9354"/>
-            <w:gridSpan w:val="4"/>
-            <w:shd w:fill="EDF2F7"/>
-            <w:tcMar>
-              <w:top w:w="90" w:type="dxa"/>
-              <w:bottom w:w="90" w:type="dxa"/>
-              <w:left w:w="100" w:type="dxa"/>
-              <w:right w:w="100" w:type="dxa"/>
-            </w:tcMar>
-            <w:vAlign w:val="center"/>
-          </w:tcPr>
-          <w:p>
-            <w:pPr>
-              <w:spacing w:before="40" w:after="40" w:line="276" w:lineRule="auto"/>
-              <w:jc w:val="left"/>
-            </w:pPr>
-            <w:r/>
-            <w:r>
-              <w:rPr>
-                <w:rFonts w:ascii="Times New Roman" w:hAnsi="Times New Roman"/>
-                <w:b/>
-                <w:i w:val="0"/>
-                <w:color w:val="1A202C"/>
-                <w:sz w:val="22"/>
-                <w:rFonts w:ascii="Times New Roman" w:hAnsi="Times New Roman" w:cs="Times New Roman"/>
-              </w:rPr>
-              <w:t>Tuần: 5   Thứ: 6   Ngày: 23/10/2026</w:t>
-            </w:r>
-          </w:p>
-        </w:tc>
-      </w:tr>
-      <w:tr>
-        <w:tc>
-          <w:tcPr>
-            <w:tcW w:type="dxa" w:w="1474"/>
-            <w:shd w:fill="F7FAFC"/>
-            <w:tcMar>
-              <w:top w:w="70" w:type="dxa"/>
-              <w:bottom w:w="70" w:type="dxa"/>
-              <w:left w:w="70" w:type="dxa"/>
-              <w:right w:w="70" w:type="dxa"/>
-            </w:tcMar>
-            <w:vAlign w:val="center"/>
-          </w:tcPr>
-          <w:p>
-            <w:pPr>
-              <w:spacing w:before="40" w:after="40" w:line="276" w:lineRule="auto"/>
-              <w:jc w:val="center"/>
-            </w:pPr>
-            <w:r/>
-            <w:r>
-              <w:rPr>
-                <w:rFonts w:ascii="Times New Roman" w:hAnsi="Times New Roman"/>
-                <w:b/>
-                <w:i w:val="0"/>
-                <w:color w:val="000000"/>
-                <w:sz w:val="21"/>
-                <w:rFonts w:ascii="Times New Roman" w:hAnsi="Times New Roman" w:cs="Times New Roman"/>
-              </w:rPr>
-              <w:t>Thời gian</w:t>
-            </w:r>
-          </w:p>
-        </w:tc>
-        <w:tc>
-          <w:tcPr>
-            <w:tcW w:type="dxa" w:w="2551"/>
-            <w:shd w:fill="F7FAFC"/>
-            <w:tcMar>
-              <w:top w:w="70" w:type="dxa"/>
-              <w:bottom w:w="70" w:type="dxa"/>
-              <w:left w:w="70" w:type="dxa"/>
-              <w:right w:w="70" w:type="dxa"/>
-            </w:tcMar>
-            <w:vAlign w:val="center"/>
-          </w:tcPr>
-          <w:p>
-            <w:pPr>
-              <w:spacing w:before="40" w:after="40" w:line="276" w:lineRule="auto"/>
-              <w:jc w:val="center"/>
-            </w:pPr>
-            <w:r/>
-            <w:r>
-              <w:rPr>
-                <w:rFonts w:ascii="Times New Roman" w:hAnsi="Times New Roman"/>
-                <w:b/>
-                <w:i w:val="0"/>
-                <w:color w:val="000000"/>
-                <w:sz w:val="21"/>
-                <w:rFonts w:ascii="Times New Roman" w:hAnsi="Times New Roman" w:cs="Times New Roman"/>
-              </w:rPr>
-              <w:t>Công việc được giao</w:t>
-            </w:r>
-          </w:p>
-        </w:tc>
-        <w:tc>
-          <w:tcPr>
-            <w:tcW w:type="dxa" w:w="3061"/>
-            <w:shd w:fill="F7FAFC"/>
-            <w:tcMar>
-              <w:top w:w="70" w:type="dxa"/>
-              <w:bottom w:w="70" w:type="dxa"/>
-              <w:left w:w="70" w:type="dxa"/>
-              <w:right w:w="70" w:type="dxa"/>
-            </w:tcMar>
-            <w:vAlign w:val="center"/>
-          </w:tcPr>
-          <w:p>
-            <w:pPr>
-              <w:spacing w:before="40" w:after="40" w:line="276" w:lineRule="auto"/>
-              <w:jc w:val="center"/>
-            </w:pPr>
-            <w:r/>
-            <w:r>
-              <w:rPr>
-                <w:rFonts w:ascii="Times New Roman" w:hAnsi="Times New Roman"/>
-                <w:b/>
-                <w:i w:val="0"/>
-                <w:color w:val="000000"/>
-                <w:sz w:val="21"/>
-                <w:rFonts w:ascii="Times New Roman" w:hAnsi="Times New Roman" w:cs="Times New Roman"/>
-              </w:rPr>
-              <w:t>Kết quả thực hiện</w:t>
-            </w:r>
-          </w:p>
-        </w:tc>
-        <w:tc>
-          <w:tcPr>
-            <w:tcW w:type="dxa" w:w="2268"/>
-            <w:shd w:fill="F7FAFC"/>
-            <w:tcMar>
-              <w:top w:w="70" w:type="dxa"/>
-              <w:bottom w:w="70" w:type="dxa"/>
-              <w:left w:w="70" w:type="dxa"/>
-              <w:right w:w="70" w:type="dxa"/>
-            </w:tcMar>
-            <w:vAlign w:val="center"/>
-          </w:tcPr>
-          <w:p>
-            <w:pPr>
-              <w:spacing w:before="40" w:after="40" w:line="276" w:lineRule="auto"/>
-              <w:jc w:val="center"/>
-            </w:pPr>
-            <w:r/>
-            <w:r>
-              <w:rPr>
-                <w:rFonts w:ascii="Times New Roman" w:hAnsi="Times New Roman"/>
-                <w:b/>
-                <w:i w:val="0"/>
-                <w:color w:val="000000"/>
-                <w:sz w:val="21"/>
-                <w:rFonts w:ascii="Times New Roman" w:hAnsi="Times New Roman" w:cs="Times New Roman"/>
-              </w:rPr>
-              <w:t>Kinh nghiệm</w:t>
-            </w:r>
-          </w:p>
-        </w:tc>
-      </w:tr>
-      <w:tr>
-        <w:tc>
-          <w:tcPr>
-            <w:tcW w:type="dxa" w:w="1474"/>
-            <w:vAlign w:val="center"/>
-            <w:tcMar>
-              <w:top w:w="70" w:type="dxa"/>
-              <w:bottom w:w="70" w:type="dxa"/>
-              <w:left w:w="70" w:type="dxa"/>
-              <w:right w:w="70" w:type="dxa"/>
-            </w:tcMar>
-          </w:tcPr>
-          <w:p>
-            <w:pPr>
-              <w:spacing w:before="40" w:after="40" w:line="276" w:lineRule="auto"/>
-              <w:jc w:val="center"/>
-            </w:pPr>
-            <w:r/>
-            <w:r>
-              <w:rPr>
-                <w:rFonts w:ascii="Times New Roman" w:hAnsi="Times New Roman"/>
-                <w:b/>
-                <w:i w:val="0"/>
-                <w:color w:val="000000"/>
-                <w:sz w:val="20"/>
-                <w:rFonts w:ascii="Times New Roman" w:hAnsi="Times New Roman" w:cs="Times New Roman"/>
-              </w:rPr>
-              <w:t>08:30 - 12:00</w:t>
-            </w:r>
-          </w:p>
-        </w:tc>
-        <w:tc>
-          <w:tcPr>
-            <w:tcW w:type="dxa" w:w="2551"/>
-            <w:vAlign w:val="center"/>
-            <w:tcMar>
-              <w:top w:w="70" w:type="dxa"/>
-              <w:bottom w:w="70" w:type="dxa"/>
-              <w:left w:w="70" w:type="dxa"/>
-              <w:right w:w="70" w:type="dxa"/>
-            </w:tcMar>
-          </w:tcPr>
-          <w:p>
-            <w:pPr>
-              <w:spacing w:before="40" w:after="40" w:line="276" w:lineRule="auto"/>
-              <w:jc w:val="left"/>
-            </w:pPr>
-            <w:r/>
-            <w:r>
-              <w:rPr>
-                <w:rFonts w:ascii="Times New Roman" w:hAnsi="Times New Roman"/>
-                <w:b w:val="0"/>
-                <w:i w:val="0"/>
-                <w:color w:val="000000"/>
-                <w:sz w:val="20"/>
-                <w:rFonts w:ascii="Times New Roman" w:hAnsi="Times New Roman" w:cs="Times New Roman"/>
-              </w:rPr>
-              <w:t>Xây dựng Không gian Phỏng vấn chuyên sâu (Interview Workspace)</w:t>
-            </w:r>
-          </w:p>
-        </w:tc>
-        <w:tc>
-          <w:tcPr>
-            <w:tcW w:type="dxa" w:w="3061"/>
-            <w:vAlign w:val="center"/>
-            <w:tcMar>
-              <w:top w:w="70" w:type="dxa"/>
-              <w:bottom w:w="70" w:type="dxa"/>
-              <w:left w:w="70" w:type="dxa"/>
-              <w:right w:w="70" w:type="dxa"/>
-            </w:tcMar>
-          </w:tcPr>
-          <w:p>
-            <w:pPr>
-              <w:spacing w:before="40" w:after="40" w:line="276" w:lineRule="auto"/>
-              <w:jc w:val="left"/>
-            </w:pPr>
-            <w:r/>
-            <w:r>
-              <w:rPr>
-                <w:rFonts w:ascii="Times New Roman" w:hAnsi="Times New Roman"/>
-                <w:b w:val="0"/>
-                <w:i w:val="0"/>
-                <w:color w:val="000000"/>
-                <w:sz w:val="20"/>
-                <w:rFonts w:ascii="Times New Roman" w:hAnsi="Times New Roman" w:cs="Times New Roman"/>
-              </w:rPr>
-              <w:t>Xây dựng tính năng lên lịch phỏng vấn (ngày giờ, Google Meet link, vòng HR/Technical/Final). Phát triển khung ghi chép chiến lược: câu hỏi thực tế từ Tech Lead, câu trả lời, feedback và khung tự rút kinh nghiệm (Self-Review &amp; Next Steps).</w:t>
-            </w:r>
-          </w:p>
-        </w:tc>
-        <w:tc>
-          <w:tcPr>
-            <w:tcW w:type="dxa" w:w="2268"/>
-            <w:vAlign w:val="center"/>
-            <w:tcMar>
-              <w:top w:w="70" w:type="dxa"/>
-              <w:bottom w:w="70" w:type="dxa"/>
-              <w:left w:w="70" w:type="dxa"/>
-              <w:right w:w="70" w:type="dxa"/>
-            </w:tcMar>
-          </w:tcPr>
-          <w:p>
-            <w:pPr>
-              <w:spacing w:before="40" w:after="40" w:line="276" w:lineRule="auto"/>
-              <w:jc w:val="left"/>
-            </w:pPr>
-            <w:r/>
-            <w:r>
-              <w:rPr>
-                <w:rFonts w:ascii="Times New Roman" w:hAnsi="Times New Roman"/>
-                <w:b w:val="0"/>
-                <w:i w:val="0"/>
-                <w:color w:val="000000"/>
-                <w:sz w:val="20"/>
-                <w:rFonts w:ascii="Times New Roman" w:hAnsi="Times New Roman" w:cs="Times New Roman"/>
-              </w:rPr>
-              <w:t>Ghi chép và tự đánh giá ngay sau mỗi buổi phỏng vấn giúp sinh viên nhanh chóng biến thất bại thành bài học kinh nghiệm để cải thiện liên tục.</w:t>
-            </w:r>
-          </w:p>
-        </w:tc>
-      </w:tr>
-      <w:tr>
-        <w:tc>
-          <w:tcPr>
-            <w:tcW w:type="dxa" w:w="1474"/>
-            <w:vAlign w:val="center"/>
-            <w:tcMar>
-              <w:top w:w="70" w:type="dxa"/>
-              <w:bottom w:w="70" w:type="dxa"/>
-              <w:left w:w="70" w:type="dxa"/>
-              <w:right w:w="70" w:type="dxa"/>
-            </w:tcMar>
-          </w:tcPr>
-          <w:p>
-            <w:pPr>
-              <w:spacing w:before="40" w:after="40" w:line="276" w:lineRule="auto"/>
-              <w:jc w:val="center"/>
-            </w:pPr>
-            <w:r/>
-            <w:r>
-              <w:rPr>
-                <w:rFonts w:ascii="Times New Roman" w:hAnsi="Times New Roman"/>
-                <w:b/>
-                <w:i w:val="0"/>
-                <w:color w:val="000000"/>
-                <w:sz w:val="20"/>
-                <w:rFonts w:ascii="Times New Roman" w:hAnsi="Times New Roman" w:cs="Times New Roman"/>
-              </w:rPr>
-              <w:t>13:00 - 17:00</w:t>
-            </w:r>
-          </w:p>
-        </w:tc>
-        <w:tc>
-          <w:tcPr>
-            <w:tcW w:type="dxa" w:w="2551"/>
-            <w:vAlign w:val="center"/>
-            <w:tcMar>
-              <w:top w:w="70" w:type="dxa"/>
-              <w:bottom w:w="70" w:type="dxa"/>
-              <w:left w:w="70" w:type="dxa"/>
-              <w:right w:w="70" w:type="dxa"/>
-            </w:tcMar>
-          </w:tcPr>
-          <w:p>
-            <w:pPr>
-              <w:spacing w:before="40" w:after="40" w:line="276" w:lineRule="auto"/>
-              <w:jc w:val="left"/>
-            </w:pPr>
-            <w:r/>
-            <w:r>
-              <w:rPr>
-                <w:rFonts w:ascii="Times New Roman" w:hAnsi="Times New Roman"/>
-                <w:b w:val="0"/>
-                <w:i w:val="0"/>
-                <w:color w:val="000000"/>
-                <w:sz w:val="20"/>
-                <w:rFonts w:ascii="Times New Roman" w:hAnsi="Times New Roman" w:cs="Times New Roman"/>
-              </w:rPr>
-              <w:t>Xây dựng Analytics Dashboard KPI, Route Sidebar &amp; Kiểm thử Build toàn diện</w:t>
-            </w:r>
-          </w:p>
-        </w:tc>
-        <w:tc>
-          <w:tcPr>
-            <w:tcW w:type="dxa" w:w="3061"/>
-            <w:vAlign w:val="center"/>
-            <w:tcMar>
-              <w:top w:w="70" w:type="dxa"/>
-              <w:bottom w:w="70" w:type="dxa"/>
-              <w:left w:w="70" w:type="dxa"/>
-              <w:right w:w="70" w:type="dxa"/>
-            </w:tcMar>
-          </w:tcPr>
-          <w:p>
-            <w:pPr>
-              <w:spacing w:before="40" w:after="40" w:line="276" w:lineRule="auto"/>
-              <w:jc w:val="left"/>
-            </w:pPr>
-            <w:r/>
-            <w:r>
-              <w:rPr>
-                <w:rFonts w:ascii="Times New Roman" w:hAnsi="Times New Roman"/>
-                <w:b w:val="0"/>
-                <w:i w:val="0"/>
-                <w:color w:val="000000"/>
-                <w:sz w:val="20"/>
-                <w:rFonts w:ascii="Times New Roman" w:hAnsi="Times New Roman" w:cs="Times New Roman"/>
-              </w:rPr>
-              <w:t>Phát triển thẻ chỉ số KPI thời gian thực: Tỷ lệ vào vòng phỏng vấn (Interview Rate %), Tỷ lệ nhận Offer (Offer Rate %). Tích hợp nút Phòng thủ đồ án trực tiếp trên thẻ. Đăng ký route /student/applications và Sidebar. Chạy 14/14 Test Suites (52/52 Tests) pass 100%, npm run build thành công 0 lỗi.</w:t>
-            </w:r>
-          </w:p>
-        </w:tc>
-        <w:tc>
-          <w:tcPr>
-            <w:tcW w:type="dxa" w:w="2268"/>
-            <w:vAlign w:val="center"/>
-            <w:tcMar>
-              <w:top w:w="70" w:type="dxa"/>
-              <w:bottom w:w="70" w:type="dxa"/>
-              <w:left w:w="70" w:type="dxa"/>
-              <w:right w:w="70" w:type="dxa"/>
-            </w:tcMar>
-          </w:tcPr>
-          <w:p>
-            <w:pPr>
-              <w:spacing w:before="40" w:after="40" w:line="276" w:lineRule="auto"/>
-              <w:jc w:val="left"/>
-            </w:pPr>
-            <w:r/>
-            <w:r>
-              <w:rPr>
-                <w:rFonts w:ascii="Times New Roman" w:hAnsi="Times New Roman"/>
-                <w:b w:val="0"/>
-                <w:i w:val="0"/>
-                <w:color w:val="000000"/>
-                <w:sz w:val="20"/>
-                <w:rFonts w:ascii="Times New Roman" w:hAnsi="Times New Roman" w:cs="Times New Roman"/>
-              </w:rPr>
-              <w:t>Hoàn thành toàn bộ hệ sinh thái ProfileHub: từ CV đồ án thực chiến, bảo vệ trước Tech Lead, đến quản lý toàn trình phỏng vấn chuẩn doanh nghiệp.</w:t>
             </w:r>
           </w:p>
         </w:tc>

</xml_diff>

<commit_message>
feat: implement STAR CV Diagnostic & Guided Elicitation Coach with zero fake metrics
</commit_message>
<xml_diff>
--- a/docs/BM01b_So_nhat_ky_thuc_tap.docx
+++ b/docs/BM01b_So_nhat_ky_thuc_tap.docx
@@ -13205,7 +13205,7 @@
           <w:sz w:val="24"/>
           <w:rFonts w:ascii="Times New Roman" w:hAnsi="Times New Roman" w:cs="Times New Roman"/>
         </w:rPr>
-        <w:t>TUẦN 5: CONTEXTUAL APPLICATION PITCH &amp; PROJECT DEFENSE BRIEFING (20/10/2026)</w:t>
+        <w:t>TUẦN 5: CONTEXTUAL APPLICATION PITCH &amp; PROJECT DEFENSE BRIEFING (20/10/2026 - 21/10/2026)</w:t>
       </w:r>
     </w:p>
     <w:tbl>
@@ -13628,6 +13628,436 @@
                 <w:rFonts w:ascii="Times New Roman" w:hAnsi="Times New Roman" w:cs="Times New Roman"/>
               </w:rPr>
               <w:t>Trang bị bản lĩnh phòng thủ đồ án trước Tech Lead giúp ứng viên tự tin vượt qua cả vòng lọc CV lẫn vòng phỏng vấn kỹ thuật chuyên sâu.</w:t>
+            </w:r>
+          </w:p>
+        </w:tc>
+      </w:tr>
+    </w:tbl>
+    <w:p>
+      <w:pPr>
+        <w:spacing w:before="0" w:after="120"/>
+      </w:pPr>
+    </w:p>
+    <w:tbl>
+      <w:tblPr>
+        <w:tblW w:type="auto" w:w="0"/>
+        <w:jc w:val="center"/>
+        <w:tblLook w:firstColumn="1" w:firstRow="1" w:lastColumn="0" w:lastRow="0" w:noHBand="0" w:noVBand="1" w:val="04A0"/>
+        <w:tblBorders>
+          <w:top w:val="single" w:sz="4" w:space="0" w:color="A0AEC0"/>
+          <w:bottom w:val="single" w:sz="4" w:space="0" w:color="A0AEC0"/>
+          <w:left w:val="single" w:sz="4" w:space="0" w:color="A0AEC0"/>
+          <w:right w:val="single" w:sz="4" w:space="0" w:color="A0AEC0"/>
+          <w:insideH w:val="single" w:sz="4" w:space="0" w:color="A0AEC0"/>
+          <w:insideV w:val="single" w:sz="4" w:space="0" w:color="A0AEC0"/>
+        </w:tblBorders>
+      </w:tblPr>
+      <w:tblGrid>
+        <w:gridCol w:w="2339"/>
+        <w:gridCol w:w="2339"/>
+        <w:gridCol w:w="2339"/>
+        <w:gridCol w:w="2339"/>
+      </w:tblGrid>
+      <w:tr>
+        <w:tc>
+          <w:tcPr>
+            <w:tcW w:type="dxa" w:w="9354"/>
+            <w:gridSpan w:val="4"/>
+            <w:shd w:fill="EDF2F7"/>
+            <w:tcMar>
+              <w:top w:w="90" w:type="dxa"/>
+              <w:bottom w:w="90" w:type="dxa"/>
+              <w:left w:w="100" w:type="dxa"/>
+              <w:right w:w="100" w:type="dxa"/>
+            </w:tcMar>
+            <w:vAlign w:val="center"/>
+          </w:tcPr>
+          <w:p>
+            <w:pPr>
+              <w:spacing w:before="40" w:after="40" w:line="276" w:lineRule="auto"/>
+              <w:jc w:val="left"/>
+            </w:pPr>
+            <w:r/>
+            <w:r>
+              <w:rPr>
+                <w:rFonts w:ascii="Times New Roman" w:hAnsi="Times New Roman"/>
+                <w:b/>
+                <w:i w:val="0"/>
+                <w:color w:val="1A202C"/>
+                <w:sz w:val="22"/>
+                <w:rFonts w:ascii="Times New Roman" w:hAnsi="Times New Roman" w:cs="Times New Roman"/>
+              </w:rPr>
+              <w:t>Tuần: 5   Thứ: 4   Ngày: 21/10/2026</w:t>
+            </w:r>
+          </w:p>
+        </w:tc>
+      </w:tr>
+      <w:tr>
+        <w:tc>
+          <w:tcPr>
+            <w:tcW w:type="dxa" w:w="1474"/>
+            <w:shd w:fill="F7FAFC"/>
+            <w:tcMar>
+              <w:top w:w="70" w:type="dxa"/>
+              <w:bottom w:w="70" w:type="dxa"/>
+              <w:left w:w="70" w:type="dxa"/>
+              <w:right w:w="70" w:type="dxa"/>
+            </w:tcMar>
+            <w:vAlign w:val="center"/>
+          </w:tcPr>
+          <w:p>
+            <w:pPr>
+              <w:spacing w:before="40" w:after="40" w:line="276" w:lineRule="auto"/>
+              <w:jc w:val="center"/>
+            </w:pPr>
+            <w:r/>
+            <w:r>
+              <w:rPr>
+                <w:rFonts w:ascii="Times New Roman" w:hAnsi="Times New Roman"/>
+                <w:b/>
+                <w:i w:val="0"/>
+                <w:color w:val="000000"/>
+                <w:sz w:val="21"/>
+                <w:rFonts w:ascii="Times New Roman" w:hAnsi="Times New Roman" w:cs="Times New Roman"/>
+              </w:rPr>
+              <w:t>Thời gian</w:t>
+            </w:r>
+          </w:p>
+        </w:tc>
+        <w:tc>
+          <w:tcPr>
+            <w:tcW w:type="dxa" w:w="2551"/>
+            <w:shd w:fill="F7FAFC"/>
+            <w:tcMar>
+              <w:top w:w="70" w:type="dxa"/>
+              <w:bottom w:w="70" w:type="dxa"/>
+              <w:left w:w="70" w:type="dxa"/>
+              <w:right w:w="70" w:type="dxa"/>
+            </w:tcMar>
+            <w:vAlign w:val="center"/>
+          </w:tcPr>
+          <w:p>
+            <w:pPr>
+              <w:spacing w:before="40" w:after="40" w:line="276" w:lineRule="auto"/>
+              <w:jc w:val="center"/>
+            </w:pPr>
+            <w:r/>
+            <w:r>
+              <w:rPr>
+                <w:rFonts w:ascii="Times New Roman" w:hAnsi="Times New Roman"/>
+                <w:b/>
+                <w:i w:val="0"/>
+                <w:color w:val="000000"/>
+                <w:sz w:val="21"/>
+                <w:rFonts w:ascii="Times New Roman" w:hAnsi="Times New Roman" w:cs="Times New Roman"/>
+              </w:rPr>
+              <w:t>Công việc được giao</w:t>
+            </w:r>
+          </w:p>
+        </w:tc>
+        <w:tc>
+          <w:tcPr>
+            <w:tcW w:type="dxa" w:w="3061"/>
+            <w:shd w:fill="F7FAFC"/>
+            <w:tcMar>
+              <w:top w:w="70" w:type="dxa"/>
+              <w:bottom w:w="70" w:type="dxa"/>
+              <w:left w:w="70" w:type="dxa"/>
+              <w:right w:w="70" w:type="dxa"/>
+            </w:tcMar>
+            <w:vAlign w:val="center"/>
+          </w:tcPr>
+          <w:p>
+            <w:pPr>
+              <w:spacing w:before="40" w:after="40" w:line="276" w:lineRule="auto"/>
+              <w:jc w:val="center"/>
+            </w:pPr>
+            <w:r/>
+            <w:r>
+              <w:rPr>
+                <w:rFonts w:ascii="Times New Roman" w:hAnsi="Times New Roman"/>
+                <w:b/>
+                <w:i w:val="0"/>
+                <w:color w:val="000000"/>
+                <w:sz w:val="21"/>
+                <w:rFonts w:ascii="Times New Roman" w:hAnsi="Times New Roman" w:cs="Times New Roman"/>
+              </w:rPr>
+              <w:t>Kết quả thực hiện</w:t>
+            </w:r>
+          </w:p>
+        </w:tc>
+        <w:tc>
+          <w:tcPr>
+            <w:tcW w:type="dxa" w:w="2268"/>
+            <w:shd w:fill="F7FAFC"/>
+            <w:tcMar>
+              <w:top w:w="70" w:type="dxa"/>
+              <w:bottom w:w="70" w:type="dxa"/>
+              <w:left w:w="70" w:type="dxa"/>
+              <w:right w:w="70" w:type="dxa"/>
+            </w:tcMar>
+            <w:vAlign w:val="center"/>
+          </w:tcPr>
+          <w:p>
+            <w:pPr>
+              <w:spacing w:before="40" w:after="40" w:line="276" w:lineRule="auto"/>
+              <w:jc w:val="center"/>
+            </w:pPr>
+            <w:r/>
+            <w:r>
+              <w:rPr>
+                <w:rFonts w:ascii="Times New Roman" w:hAnsi="Times New Roman"/>
+                <w:b/>
+                <w:i w:val="0"/>
+                <w:color w:val="000000"/>
+                <w:sz w:val="21"/>
+                <w:rFonts w:ascii="Times New Roman" w:hAnsi="Times New Roman" w:cs="Times New Roman"/>
+              </w:rPr>
+              <w:t>Kinh nghiệm</w:t>
+            </w:r>
+          </w:p>
+        </w:tc>
+      </w:tr>
+      <w:tr>
+        <w:tc>
+          <w:tcPr>
+            <w:tcW w:type="dxa" w:w="1474"/>
+            <w:vAlign w:val="center"/>
+            <w:tcMar>
+              <w:top w:w="70" w:type="dxa"/>
+              <w:bottom w:w="70" w:type="dxa"/>
+              <w:left w:w="70" w:type="dxa"/>
+              <w:right w:w="70" w:type="dxa"/>
+            </w:tcMar>
+          </w:tcPr>
+          <w:p>
+            <w:pPr>
+              <w:spacing w:before="40" w:after="40" w:line="276" w:lineRule="auto"/>
+              <w:jc w:val="center"/>
+            </w:pPr>
+            <w:r/>
+            <w:r>
+              <w:rPr>
+                <w:rFonts w:ascii="Times New Roman" w:hAnsi="Times New Roman"/>
+                <w:b/>
+                <w:i w:val="0"/>
+                <w:color w:val="000000"/>
+                <w:sz w:val="20"/>
+                <w:rFonts w:ascii="Times New Roman" w:hAnsi="Times New Roman" w:cs="Times New Roman"/>
+              </w:rPr>
+              <w:t>08:30 - 12:00</w:t>
+            </w:r>
+          </w:p>
+        </w:tc>
+        <w:tc>
+          <w:tcPr>
+            <w:tcW w:type="dxa" w:w="2551"/>
+            <w:vAlign w:val="center"/>
+            <w:tcMar>
+              <w:top w:w="70" w:type="dxa"/>
+              <w:bottom w:w="70" w:type="dxa"/>
+              <w:left w:w="70" w:type="dxa"/>
+              <w:right w:w="70" w:type="dxa"/>
+            </w:tcMar>
+          </w:tcPr>
+          <w:p>
+            <w:pPr>
+              <w:spacing w:before="40" w:after="40" w:line="276" w:lineRule="auto"/>
+              <w:jc w:val="left"/>
+            </w:pPr>
+            <w:r/>
+            <w:r>
+              <w:rPr>
+                <w:rFonts w:ascii="Times New Roman" w:hAnsi="Times New Roman"/>
+                <w:b w:val="0"/>
+                <w:i w:val="0"/>
+                <w:color w:val="000000"/>
+                <w:sz w:val="20"/>
+                <w:rFonts w:ascii="Times New Roman" w:hAnsi="Times New Roman" w:cs="Times New Roman"/>
+              </w:rPr>
+              <w:t>Nghiên cứu bản chất số liệu đo lường kỹ thuật, lập kế hoạch Star CV Diagnostic</w:t>
+            </w:r>
+          </w:p>
+        </w:tc>
+        <w:tc>
+          <w:tcPr>
+            <w:tcW w:type="dxa" w:w="3061"/>
+            <w:vAlign w:val="center"/>
+            <w:tcMar>
+              <w:top w:w="70" w:type="dxa"/>
+              <w:bottom w:w="70" w:type="dxa"/>
+              <w:left w:w="70" w:type="dxa"/>
+              <w:right w:w="70" w:type="dxa"/>
+            </w:tcMar>
+          </w:tcPr>
+          <w:p>
+            <w:pPr>
+              <w:spacing w:before="40" w:after="40" w:line="276" w:lineRule="auto"/>
+              <w:jc w:val="left"/>
+            </w:pPr>
+            <w:r/>
+            <w:r>
+              <w:rPr>
+                <w:rFonts w:ascii="Times New Roman" w:hAnsi="Times New Roman"/>
+                <w:b w:val="0"/>
+                <w:i w:val="0"/>
+                <w:color w:val="000000"/>
+                <w:sz w:val="20"/>
+                <w:rFonts w:ascii="Times New Roman" w:hAnsi="Times New Roman" w:cs="Times New Roman"/>
+              </w:rPr>
+              <w:t>Phân tích nguồn gốc số liệu đo lường trong đồ án sinh viên/Junior: Khẳng định nguyên tắc không bịa số liệu kinh doanh viển vông để tránh rủi ro khi Tech Lead hỏi. Xác lập 4 nguồn số đo kỹ thuật tái hiện được (EXPLAIN ANALYZE, k6 load test, Lighthouse, Vitest coverage). Ban hành kế hoạch triển khai.</w:t>
+            </w:r>
+          </w:p>
+        </w:tc>
+        <w:tc>
+          <w:tcPr>
+            <w:tcW w:type="dxa" w:w="2268"/>
+            <w:vAlign w:val="center"/>
+            <w:tcMar>
+              <w:top w:w="70" w:type="dxa"/>
+              <w:bottom w:w="70" w:type="dxa"/>
+              <w:left w:w="70" w:type="dxa"/>
+              <w:right w:w="70" w:type="dxa"/>
+            </w:tcMar>
+          </w:tcPr>
+          <w:p>
+            <w:pPr>
+              <w:spacing w:before="40" w:after="40" w:line="276" w:lineRule="auto"/>
+              <w:jc w:val="left"/>
+            </w:pPr>
+            <w:r/>
+            <w:r>
+              <w:rPr>
+                <w:rFonts w:ascii="Times New Roman" w:hAnsi="Times New Roman"/>
+                <w:b w:val="0"/>
+                <w:i w:val="0"/>
+                <w:color w:val="000000"/>
+                <w:sz w:val="20"/>
+                <w:rFonts w:ascii="Times New Roman" w:hAnsi="Times New Roman" w:cs="Times New Roman"/>
+              </w:rPr>
+              <w:t>Số liệu đo lường trong CV công nghệ phải có căn cứ kỹ thuật và công cụ đo rõ ràng để ứng viên tự tin chứng minh khi phỏng vấn.</w:t>
+            </w:r>
+          </w:p>
+        </w:tc>
+      </w:tr>
+      <w:tr>
+        <w:tc>
+          <w:tcPr>
+            <w:tcW w:type="dxa" w:w="1474"/>
+            <w:vAlign w:val="center"/>
+            <w:tcMar>
+              <w:top w:w="70" w:type="dxa"/>
+              <w:bottom w:w="70" w:type="dxa"/>
+              <w:left w:w="70" w:type="dxa"/>
+              <w:right w:w="70" w:type="dxa"/>
+            </w:tcMar>
+          </w:tcPr>
+          <w:p>
+            <w:pPr>
+              <w:spacing w:before="40" w:after="40" w:line="276" w:lineRule="auto"/>
+              <w:jc w:val="center"/>
+            </w:pPr>
+            <w:r/>
+            <w:r>
+              <w:rPr>
+                <w:rFonts w:ascii="Times New Roman" w:hAnsi="Times New Roman"/>
+                <w:b/>
+                <w:i w:val="0"/>
+                <w:color w:val="000000"/>
+                <w:sz w:val="20"/>
+                <w:rFonts w:ascii="Times New Roman" w:hAnsi="Times New Roman" w:cs="Times New Roman"/>
+              </w:rPr>
+              <w:t>13:00 - 17:00</w:t>
+            </w:r>
+          </w:p>
+        </w:tc>
+        <w:tc>
+          <w:tcPr>
+            <w:tcW w:type="dxa" w:w="2551"/>
+            <w:vAlign w:val="center"/>
+            <w:tcMar>
+              <w:top w:w="70" w:type="dxa"/>
+              <w:bottom w:w="70" w:type="dxa"/>
+              <w:left w:w="70" w:type="dxa"/>
+              <w:right w:w="70" w:type="dxa"/>
+            </w:tcMar>
+          </w:tcPr>
+          <w:p>
+            <w:pPr>
+              <w:spacing w:before="40" w:after="40" w:line="276" w:lineRule="auto"/>
+              <w:jc w:val="left"/>
+            </w:pPr>
+            <w:r/>
+            <w:r>
+              <w:rPr>
+                <w:rFonts w:ascii="Times New Roman" w:hAnsi="Times New Roman"/>
+                <w:b w:val="0"/>
+                <w:i w:val="0"/>
+                <w:color w:val="000000"/>
+                <w:sz w:val="20"/>
+                <w:rFonts w:ascii="Times New Roman" w:hAnsi="Times New Roman" w:cs="Times New Roman"/>
+              </w:rPr>
+              <w:t>Xây dựng starDiagnosticService &amp; StarCvDiagnosticModal (Trợ lý Soi &amp; Khai thác STAR)</w:t>
+            </w:r>
+          </w:p>
+        </w:tc>
+        <w:tc>
+          <w:tcPr>
+            <w:tcW w:type="dxa" w:w="3061"/>
+            <w:vAlign w:val="center"/>
+            <w:tcMar>
+              <w:top w:w="70" w:type="dxa"/>
+              <w:bottom w:w="70" w:type="dxa"/>
+              <w:left w:w="70" w:type="dxa"/>
+              <w:right w:w="70" w:type="dxa"/>
+            </w:tcMar>
+          </w:tcPr>
+          <w:p>
+            <w:pPr>
+              <w:spacing w:before="40" w:after="40" w:line="276" w:lineRule="auto"/>
+              <w:jc w:val="left"/>
+            </w:pPr>
+            <w:r/>
+            <w:r>
+              <w:rPr>
+                <w:rFonts w:ascii="Times New Roman" w:hAnsi="Times New Roman"/>
+                <w:b w:val="0"/>
+                <w:i w:val="0"/>
+                <w:color w:val="000000"/>
+                <w:sz w:val="20"/>
+                <w:rFonts w:ascii="Times New Roman" w:hAnsi="Times New Roman" w:cs="Times New Roman"/>
+              </w:rPr>
+              <w:t>Xây dựng starDiagnosticService.ts chẩn đoán câu chữ, phát hiện từ mơ hồ, tính điểm STAR Score và sinh bộ 3 câu hỏi gợi mở thực tế. Xây dựng StarCvDiagnosticModal.tsx (hỗ trợ Soi CV có sẵn và Wizard từ trang giấy trắng). Tích hợp CVBuilder.tsx với 1-Click đưa vào CV Canvas. Nâng tổng số test lên 14 suites (51 tests) pass 100%.</w:t>
+            </w:r>
+          </w:p>
+        </w:tc>
+        <w:tc>
+          <w:tcPr>
+            <w:tcW w:type="dxa" w:w="2268"/>
+            <w:vAlign w:val="center"/>
+            <w:tcMar>
+              <w:top w:w="70" w:type="dxa"/>
+              <w:bottom w:w="70" w:type="dxa"/>
+              <w:left w:w="70" w:type="dxa"/>
+              <w:right w:w="70" w:type="dxa"/>
+            </w:tcMar>
+          </w:tcPr>
+          <w:p>
+            <w:pPr>
+              <w:spacing w:before="40" w:after="40" w:line="276" w:lineRule="auto"/>
+              <w:jc w:val="left"/>
+            </w:pPr>
+            <w:r/>
+            <w:r>
+              <w:rPr>
+                <w:rFonts w:ascii="Times New Roman" w:hAnsi="Times New Roman"/>
+                <w:b w:val="0"/>
+                <w:i w:val="0"/>
+                <w:color w:val="000000"/>
+                <w:sz w:val="20"/>
+                <w:rFonts w:ascii="Times New Roman" w:hAnsi="Times New Roman" w:cs="Times New Roman"/>
+              </w:rPr>
+              <w:t>Trợ lý AI xuất sắc là công cụ đặt đúng câu hỏi gợi mở để ứng viên tự tin kể lại thành tựu kỹ thuật có thật thay vì tự tiện bịa số liệu ảo.</w:t>
             </w:r>
           </w:p>
         </w:tc>

</xml_diff>